<commit_message>
Finishing touches on LAB5
</commit_message>
<xml_diff>
--- a/523C0012_LAB1.docx
+++ b/523C0012_LAB1.docx
@@ -5,59 +5,6 @@
     <w:p>
       <w:pPr>
         <w:pStyle w:val="Heading1"/>
-        <w:jc w:val="center"/>
-        <w:rPr>
-          <w:rFonts w:ascii="Times New Roman" w:hAnsi="Times New Roman" w:cs="Times New Roman"/>
-          <w:color w:val="000000" w:themeColor="text1"/>
-          <w:lang w:val="en-US"/>
-        </w:rPr>
-      </w:pPr>
-      <w:r>
-        <w:rPr>
-          <w:rFonts w:ascii="Times New Roman" w:hAnsi="Times New Roman" w:cs="Times New Roman"/>
-          <w:color w:val="000000" w:themeColor="text1"/>
-          <w:lang w:val="vi-VN"/>
-        </w:rPr>
-        <w:t xml:space="preserve">Software Engineering – Lab </w:t>
-      </w:r>
-      <w:r>
-        <w:rPr>
-          <w:rFonts w:ascii="Times New Roman" w:hAnsi="Times New Roman" w:cs="Times New Roman"/>
-          <w:color w:val="000000" w:themeColor="text1"/>
-          <w:lang w:val="en-US"/>
-        </w:rPr>
-        <w:t>1</w:t>
-      </w:r>
-      <w:r>
-        <w:rPr>
-          <w:rFonts w:ascii="Times New Roman" w:hAnsi="Times New Roman" w:cs="Times New Roman"/>
-          <w:color w:val="000000" w:themeColor="text1"/>
-          <w:lang w:val="vi-VN"/>
-        </w:rPr>
-        <w:t xml:space="preserve"> Report</w:t>
-      </w:r>
-      <w:r>
-        <w:rPr>
-          <w:rFonts w:ascii="Times New Roman" w:hAnsi="Times New Roman" w:cs="Times New Roman"/>
-          <w:color w:val="000000" w:themeColor="text1"/>
-          <w:lang w:val="vi-VN"/>
-        </w:rPr>
-        <w:br/>
-        <w:t>Huynh Nhat Huy – 523c0012</w:t>
-      </w:r>
-      <w:r>
-        <w:rPr>
-          <w:rFonts w:ascii="Times New Roman" w:hAnsi="Times New Roman" w:cs="Times New Roman"/>
-          <w:color w:val="000000" w:themeColor="text1"/>
-          <w:lang w:val="vi-VN"/>
-        </w:rPr>
-        <w:br/>
-        <w:t>Software Engineering (2025 – 2026) - TDTU</w:t>
-      </w:r>
-    </w:p>
-    <w:p>
-      <w:pPr>
-        <w:pStyle w:val="Heading1"/>
         <w:rPr>
           <w:rFonts w:ascii="Times New Roman" w:hAnsi="Times New Roman" w:cs="Times New Roman"/>
           <w:bCs/>
@@ -440,7 +387,6 @@
           <w:szCs w:val="28"/>
           <w:lang w:val="en-US"/>
         </w:rPr>
-        <w:lastRenderedPageBreak/>
         <w:t xml:space="preserve">In Exercise 10: I learnt how to use the </w:t>
       </w:r>
       <w:proofErr w:type="spellStart"/>
@@ -638,7 +584,7 @@
                     <pic:cNvPicPr/>
                   </pic:nvPicPr>
                   <pic:blipFill rotWithShape="1">
-                    <a:blip r:embed="rId4" cstate="print">
+                    <a:blip r:embed="rId6" cstate="print">
                       <a:extLst>
                         <a:ext uri="{28A0092B-C50C-407E-A947-70E740481C1C}">
                           <a14:useLocalDpi xmlns:a14="http://schemas.microsoft.com/office/drawing/2010/main" val="0"/>
@@ -723,7 +669,7 @@
                     <pic:cNvPicPr/>
                   </pic:nvPicPr>
                   <pic:blipFill>
-                    <a:blip r:embed="rId5" cstate="print">
+                    <a:blip r:embed="rId7" cstate="print">
                       <a:extLst>
                         <a:ext uri="{28A0092B-C50C-407E-A947-70E740481C1C}">
                           <a14:useLocalDpi xmlns:a14="http://schemas.microsoft.com/office/drawing/2010/main" val="0"/>
@@ -791,6 +737,7 @@
           <w:noProof/>
           <w:color w:val="000000" w:themeColor="text1"/>
         </w:rPr>
+        <w:lastRenderedPageBreak/>
         <w:drawing>
           <wp:inline distT="0" distB="0" distL="0" distR="0" wp14:anchorId="3385306D" wp14:editId="179F9420">
             <wp:extent cx="5943600" cy="3598545"/>
@@ -807,7 +754,7 @@
                     <pic:cNvPicPr/>
                   </pic:nvPicPr>
                   <pic:blipFill>
-                    <a:blip r:embed="rId6" cstate="print">
+                    <a:blip r:embed="rId8" cstate="print">
                       <a:extLst>
                         <a:ext uri="{28A0092B-C50C-407E-A947-70E740481C1C}">
                           <a14:useLocalDpi xmlns:a14="http://schemas.microsoft.com/office/drawing/2010/main" val="0"/>
@@ -874,7 +821,7 @@
                     <pic:cNvPicPr/>
                   </pic:nvPicPr>
                   <pic:blipFill rotWithShape="1">
-                    <a:blip r:embed="rId7" cstate="print">
+                    <a:blip r:embed="rId9" cstate="print">
                       <a:extLst>
                         <a:ext uri="{28A0092B-C50C-407E-A947-70E740481C1C}">
                           <a14:useLocalDpi xmlns:a14="http://schemas.microsoft.com/office/drawing/2010/main" val="0"/>
@@ -942,6 +889,7 @@
           <w:noProof/>
           <w:color w:val="000000" w:themeColor="text1"/>
         </w:rPr>
+        <w:lastRenderedPageBreak/>
         <w:drawing>
           <wp:inline distT="0" distB="0" distL="0" distR="0">
             <wp:extent cx="6028267" cy="3536315"/>
@@ -958,7 +906,7 @@
                     <pic:cNvPicPr/>
                   </pic:nvPicPr>
                   <pic:blipFill rotWithShape="1">
-                    <a:blip r:embed="rId8" cstate="print">
+                    <a:blip r:embed="rId10" cstate="print">
                       <a:extLst>
                         <a:ext uri="{28A0092B-C50C-407E-A947-70E740481C1C}">
                           <a14:useLocalDpi xmlns:a14="http://schemas.microsoft.com/office/drawing/2010/main" val="0"/>
@@ -1043,7 +991,7 @@
                     <pic:cNvPicPr/>
                   </pic:nvPicPr>
                   <pic:blipFill rotWithShape="1">
-                    <a:blip r:embed="rId9" cstate="print">
+                    <a:blip r:embed="rId11" cstate="print">
                       <a:extLst>
                         <a:ext uri="{28A0092B-C50C-407E-A947-70E740481C1C}">
                           <a14:useLocalDpi xmlns:a14="http://schemas.microsoft.com/office/drawing/2010/main" val="0"/>
@@ -1102,6 +1050,7 @@
           <w:bCs/>
           <w:color w:val="000000" w:themeColor="text1"/>
         </w:rPr>
+        <w:lastRenderedPageBreak/>
         <w:t>17</w:t>
       </w:r>
       <w:r>
@@ -1127,7 +1076,7 @@
                     <pic:cNvPicPr/>
                   </pic:nvPicPr>
                   <pic:blipFill>
-                    <a:blip r:embed="rId10" cstate="print">
+                    <a:blip r:embed="rId12" cstate="print">
                       <a:extLst>
                         <a:ext uri="{28A0092B-C50C-407E-A947-70E740481C1C}">
                           <a14:useLocalDpi xmlns:a14="http://schemas.microsoft.com/office/drawing/2010/main" val="0"/>
@@ -1195,6 +1144,7 @@
           <w:noProof/>
           <w:color w:val="000000" w:themeColor="text1"/>
         </w:rPr>
+        <w:lastRenderedPageBreak/>
         <w:drawing>
           <wp:inline distT="0" distB="0" distL="0" distR="0" wp14:anchorId="182A4A68" wp14:editId="2975421D">
             <wp:extent cx="5943600" cy="3324860"/>
@@ -1211,7 +1161,7 @@
                     <pic:cNvPicPr/>
                   </pic:nvPicPr>
                   <pic:blipFill>
-                    <a:blip r:embed="rId11" cstate="print">
+                    <a:blip r:embed="rId13" cstate="print">
                       <a:extLst>
                         <a:ext uri="{28A0092B-C50C-407E-A947-70E740481C1C}">
                           <a14:useLocalDpi xmlns:a14="http://schemas.microsoft.com/office/drawing/2010/main" val="0"/>
@@ -1286,7 +1236,7 @@
                     <pic:cNvPicPr/>
                   </pic:nvPicPr>
                   <pic:blipFill>
-                    <a:blip r:embed="rId12" cstate="print">
+                    <a:blip r:embed="rId14" cstate="print">
                       <a:extLst>
                         <a:ext uri="{28A0092B-C50C-407E-A947-70E740481C1C}">
                           <a14:useLocalDpi xmlns:a14="http://schemas.microsoft.com/office/drawing/2010/main" val="0"/>
@@ -1362,7 +1312,7 @@
                     <pic:cNvPicPr/>
                   </pic:nvPicPr>
                   <pic:blipFill>
-                    <a:blip r:embed="rId13" cstate="print">
+                    <a:blip r:embed="rId15" cstate="print">
                       <a:extLst>
                         <a:ext uri="{28A0092B-C50C-407E-A947-70E740481C1C}">
                           <a14:useLocalDpi xmlns:a14="http://schemas.microsoft.com/office/drawing/2010/main" val="0"/>
@@ -1407,6 +1357,7 @@
       </w:r>
     </w:p>
     <w:sectPr>
+      <w:headerReference w:type="default" r:id="rId16"/>
       <w:pgSz w:w="12240" w:h="15840"/>
       <w:pgMar w:top="1440" w:right="1440" w:bottom="1440" w:left="1440" w:header="708" w:footer="708" w:gutter="0"/>
       <w:cols w:space="708"/>
@@ -1414,6 +1365,114 @@
     </w:sectPr>
   </w:body>
 </w:document>
+</file>
+
+<file path=word/endnotes.xml><?xml version="1.0" encoding="utf-8"?>
+<w:endnotes xmlns:wpc="http://schemas.microsoft.com/office/word/2010/wordprocessingCanvas" xmlns:cx="http://schemas.microsoft.com/office/drawing/2014/chartex" xmlns:cx1="http://schemas.microsoft.com/office/drawing/2015/9/8/chartex" xmlns:cx2="http://schemas.microsoft.com/office/drawing/2015/10/21/chartex" xmlns:cx3="http://schemas.microsoft.com/office/drawing/2016/5/9/chartex" xmlns:cx4="http://schemas.microsoft.com/office/drawing/2016/5/10/chartex" xmlns:cx5="http://schemas.microsoft.com/office/drawing/2016/5/11/chartex" xmlns:cx6="http://schemas.microsoft.com/office/drawing/2016/5/12/chartex" xmlns:cx7="http://schemas.microsoft.com/office/drawing/2016/5/13/chartex" xmlns:cx8="http://schemas.microsoft.com/office/drawing/2016/5/14/chartex" xmlns:mc="http://schemas.openxmlformats.org/markup-compatibility/2006" xmlns:aink="http://schemas.microsoft.com/office/drawing/2016/ink" xmlns:am3d="http://schemas.microsoft.com/office/drawing/2017/model3d" xmlns:o="urn:schemas-microsoft-com:office:office" xmlns:oel="http://schemas.microsoft.com/office/2019/extlst" xmlns:r="http://schemas.openxmlformats.org/officeDocument/2006/relationships" xmlns:m="http://schemas.openxmlformats.org/officeDocument/2006/math" xmlns:v="urn:schemas-microsoft-com:vml" xmlns:wp14="http://schemas.microsoft.com/office/word/2010/wordprocessingDrawing" xmlns:wp="http://schemas.openxmlformats.org/drawingml/2006/wordprocessingDrawing" xmlns:w10="urn:schemas-microsoft-com:office:word" xmlns:w="http://schemas.openxmlformats.org/wordprocessingml/2006/main" xmlns:w14="http://schemas.microsoft.com/office/word/2010/wordml" xmlns:w15="http://schemas.microsoft.com/office/word/2012/wordml" xmlns:w16cex="http://schemas.microsoft.com/office/word/2018/wordml/cex" xmlns:w16cid="http://schemas.microsoft.com/office/word/2016/wordml/cid" xmlns:w16="http://schemas.microsoft.com/office/word/2018/wordml" xmlns:w16du="http://schemas.microsoft.com/office/word/2023/wordml/word16du" xmlns:w16sdtdh="http://schemas.microsoft.com/office/word/2020/wordml/sdtdatahash" xmlns:w16sdtfl="http://schemas.microsoft.com/office/word/2024/wordml/sdtformatlock" xmlns:w16se="http://schemas.microsoft.com/office/word/2015/wordml/symex" xmlns:wpg="http://schemas.microsoft.com/office/word/2010/wordprocessingGroup" xmlns:wpi="http://schemas.microsoft.com/office/word/2010/wordprocessingInk" xmlns:wne="http://schemas.microsoft.com/office/word/2006/wordml" xmlns:wps="http://schemas.microsoft.com/office/word/2010/wordprocessingShape" mc:Ignorable="w14 w15 w16se w16cid w16 w16cex w16sdtdh w16sdtfl w16du wp14">
+  <w:endnote w:type="separator" w:id="-1">
+    <w:p>
+      <w:pPr>
+        <w:spacing w:after="0" w:line="240" w:lineRule="auto"/>
+      </w:pPr>
+      <w:r>
+        <w:separator/>
+      </w:r>
+    </w:p>
+  </w:endnote>
+  <w:endnote w:type="continuationSeparator" w:id="0">
+    <w:p>
+      <w:pPr>
+        <w:spacing w:after="0" w:line="240" w:lineRule="auto"/>
+      </w:pPr>
+      <w:r>
+        <w:continuationSeparator/>
+      </w:r>
+    </w:p>
+  </w:endnote>
+</w:endnotes>
+</file>
+
+<file path=word/footnotes.xml><?xml version="1.0" encoding="utf-8"?>
+<w:footnotes xmlns:wpc="http://schemas.microsoft.com/office/word/2010/wordprocessingCanvas" xmlns:cx="http://schemas.microsoft.com/office/drawing/2014/chartex" xmlns:cx1="http://schemas.microsoft.com/office/drawing/2015/9/8/chartex" xmlns:cx2="http://schemas.microsoft.com/office/drawing/2015/10/21/chartex" xmlns:cx3="http://schemas.microsoft.com/office/drawing/2016/5/9/chartex" xmlns:cx4="http://schemas.microsoft.com/office/drawing/2016/5/10/chartex" xmlns:cx5="http://schemas.microsoft.com/office/drawing/2016/5/11/chartex" xmlns:cx6="http://schemas.microsoft.com/office/drawing/2016/5/12/chartex" xmlns:cx7="http://schemas.microsoft.com/office/drawing/2016/5/13/chartex" xmlns:cx8="http://schemas.microsoft.com/office/drawing/2016/5/14/chartex" xmlns:mc="http://schemas.openxmlformats.org/markup-compatibility/2006" xmlns:aink="http://schemas.microsoft.com/office/drawing/2016/ink" xmlns:am3d="http://schemas.microsoft.com/office/drawing/2017/model3d" xmlns:o="urn:schemas-microsoft-com:office:office" xmlns:oel="http://schemas.microsoft.com/office/2019/extlst" xmlns:r="http://schemas.openxmlformats.org/officeDocument/2006/relationships" xmlns:m="http://schemas.openxmlformats.org/officeDocument/2006/math" xmlns:v="urn:schemas-microsoft-com:vml" xmlns:wp14="http://schemas.microsoft.com/office/word/2010/wordprocessingDrawing" xmlns:wp="http://schemas.openxmlformats.org/drawingml/2006/wordprocessingDrawing" xmlns:w10="urn:schemas-microsoft-com:office:word" xmlns:w="http://schemas.openxmlformats.org/wordprocessingml/2006/main" xmlns:w14="http://schemas.microsoft.com/office/word/2010/wordml" xmlns:w15="http://schemas.microsoft.com/office/word/2012/wordml" xmlns:w16cex="http://schemas.microsoft.com/office/word/2018/wordml/cex" xmlns:w16cid="http://schemas.microsoft.com/office/word/2016/wordml/cid" xmlns:w16="http://schemas.microsoft.com/office/word/2018/wordml" xmlns:w16du="http://schemas.microsoft.com/office/word/2023/wordml/word16du" xmlns:w16sdtdh="http://schemas.microsoft.com/office/word/2020/wordml/sdtdatahash" xmlns:w16sdtfl="http://schemas.microsoft.com/office/word/2024/wordml/sdtformatlock" xmlns:w16se="http://schemas.microsoft.com/office/word/2015/wordml/symex" xmlns:wpg="http://schemas.microsoft.com/office/word/2010/wordprocessingGroup" xmlns:wpi="http://schemas.microsoft.com/office/word/2010/wordprocessingInk" xmlns:wne="http://schemas.microsoft.com/office/word/2006/wordml" xmlns:wps="http://schemas.microsoft.com/office/word/2010/wordprocessingShape" mc:Ignorable="w14 w15 w16se w16cid w16 w16cex w16sdtdh w16sdtfl w16du wp14">
+  <w:footnote w:type="separator" w:id="-1">
+    <w:p>
+      <w:pPr>
+        <w:spacing w:after="0" w:line="240" w:lineRule="auto"/>
+      </w:pPr>
+      <w:r>
+        <w:separator/>
+      </w:r>
+    </w:p>
+  </w:footnote>
+  <w:footnote w:type="continuationSeparator" w:id="0">
+    <w:p>
+      <w:pPr>
+        <w:spacing w:after="0" w:line="240" w:lineRule="auto"/>
+      </w:pPr>
+      <w:r>
+        <w:continuationSeparator/>
+      </w:r>
+    </w:p>
+  </w:footnote>
+</w:footnotes>
+</file>
+
+<file path=word/header1.xml><?xml version="1.0" encoding="utf-8"?>
+<w:hdr xmlns:wpc="http://schemas.microsoft.com/office/word/2010/wordprocessingCanvas" xmlns:cx="http://schemas.microsoft.com/office/drawing/2014/chartex" xmlns:cx1="http://schemas.microsoft.com/office/drawing/2015/9/8/chartex" xmlns:cx2="http://schemas.microsoft.com/office/drawing/2015/10/21/chartex" xmlns:cx3="http://schemas.microsoft.com/office/drawing/2016/5/9/chartex" xmlns:cx4="http://schemas.microsoft.com/office/drawing/2016/5/10/chartex" xmlns:cx5="http://schemas.microsoft.com/office/drawing/2016/5/11/chartex" xmlns:cx6="http://schemas.microsoft.com/office/drawing/2016/5/12/chartex" xmlns:cx7="http://schemas.microsoft.com/office/drawing/2016/5/13/chartex" xmlns:cx8="http://schemas.microsoft.com/office/drawing/2016/5/14/chartex" xmlns:mc="http://schemas.openxmlformats.org/markup-compatibility/2006" xmlns:aink="http://schemas.microsoft.com/office/drawing/2016/ink" xmlns:am3d="http://schemas.microsoft.com/office/drawing/2017/model3d" xmlns:o="urn:schemas-microsoft-com:office:office" xmlns:oel="http://schemas.microsoft.com/office/2019/extlst" xmlns:r="http://schemas.openxmlformats.org/officeDocument/2006/relationships" xmlns:m="http://schemas.openxmlformats.org/officeDocument/2006/math" xmlns:v="urn:schemas-microsoft-com:vml" xmlns:wp14="http://schemas.microsoft.com/office/word/2010/wordprocessingDrawing" xmlns:wp="http://schemas.openxmlformats.org/drawingml/2006/wordprocessingDrawing" xmlns:w10="urn:schemas-microsoft-com:office:word" xmlns:w="http://schemas.openxmlformats.org/wordprocessingml/2006/main" xmlns:w14="http://schemas.microsoft.com/office/word/2010/wordml" xmlns:w15="http://schemas.microsoft.com/office/word/2012/wordml" xmlns:w16cex="http://schemas.microsoft.com/office/word/2018/wordml/cex" xmlns:w16cid="http://schemas.microsoft.com/office/word/2016/wordml/cid" xmlns:w16="http://schemas.microsoft.com/office/word/2018/wordml" xmlns:w16du="http://schemas.microsoft.com/office/word/2023/wordml/word16du" xmlns:w16sdtdh="http://schemas.microsoft.com/office/word/2020/wordml/sdtdatahash" xmlns:w16sdtfl="http://schemas.microsoft.com/office/word/2024/wordml/sdtformatlock" xmlns:w16se="http://schemas.microsoft.com/office/word/2015/wordml/symex" xmlns:wpg="http://schemas.microsoft.com/office/word/2010/wordprocessingGroup" xmlns:wpi="http://schemas.microsoft.com/office/word/2010/wordprocessingInk" xmlns:wne="http://schemas.microsoft.com/office/word/2006/wordml" xmlns:wps="http://schemas.microsoft.com/office/word/2010/wordprocessingShape" mc:Ignorable="w14 w15 w16se w16cid w16 w16cex w16sdtdh w16sdtfl w16du wp14">
+  <w:p>
+    <w:pPr>
+      <w:pStyle w:val="Heading1"/>
+      <w:jc w:val="center"/>
+      <w:rPr>
+        <w:rFonts w:ascii="Times New Roman" w:hAnsi="Times New Roman" w:cs="Times New Roman"/>
+        <w:color w:val="000000" w:themeColor="text1"/>
+        <w:lang w:val="en-US"/>
+      </w:rPr>
+    </w:pPr>
+    <w:r>
+      <w:rPr>
+        <w:rFonts w:ascii="Times New Roman" w:hAnsi="Times New Roman" w:cs="Times New Roman"/>
+        <w:color w:val="000000" w:themeColor="text1"/>
+        <w:lang w:val="vi-VN"/>
+      </w:rPr>
+      <w:t xml:space="preserve">Software Engineering – Lab </w:t>
+    </w:r>
+    <w:r>
+      <w:rPr>
+        <w:rFonts w:ascii="Times New Roman" w:hAnsi="Times New Roman" w:cs="Times New Roman"/>
+        <w:color w:val="000000" w:themeColor="text1"/>
+        <w:lang w:val="en-US"/>
+      </w:rPr>
+      <w:t>1</w:t>
+    </w:r>
+    <w:r>
+      <w:rPr>
+        <w:rFonts w:ascii="Times New Roman" w:hAnsi="Times New Roman" w:cs="Times New Roman"/>
+        <w:color w:val="000000" w:themeColor="text1"/>
+        <w:lang w:val="vi-VN"/>
+      </w:rPr>
+      <w:t xml:space="preserve"> Report</w:t>
+    </w:r>
+    <w:r>
+      <w:rPr>
+        <w:rFonts w:ascii="Times New Roman" w:hAnsi="Times New Roman" w:cs="Times New Roman"/>
+        <w:color w:val="000000" w:themeColor="text1"/>
+        <w:lang w:val="vi-VN"/>
+      </w:rPr>
+      <w:br/>
+      <w:t>Huynh Nhat Huy – 523c0012</w:t>
+    </w:r>
+    <w:r>
+      <w:rPr>
+        <w:rFonts w:ascii="Times New Roman" w:hAnsi="Times New Roman" w:cs="Times New Roman"/>
+        <w:color w:val="000000" w:themeColor="text1"/>
+        <w:lang w:val="vi-VN"/>
+      </w:rPr>
+      <w:br/>
+      <w:t>Software Engineering (2025 – 2026) - TDTU</w:t>
+    </w:r>
+  </w:p>
+</w:hdr>
 </file>
 
 <file path=word/styles.xml><?xml version="1.0" encoding="utf-8"?>
@@ -2372,6 +2431,50 @@
       <w14:ligatures w14:val="none"/>
     </w:rPr>
   </w:style>
+  <w:style w:type="paragraph" w:styleId="Header">
+    <w:name w:val="header"/>
+    <w:basedOn w:val="Normal"/>
+    <w:link w:val="HeaderChar"/>
+    <w:uiPriority w:val="99"/>
+    <w:unhideWhenUsed/>
+    <w:rsid w:val="00094F29"/>
+    <w:pPr>
+      <w:tabs>
+        <w:tab w:val="center" w:pos="4680"/>
+        <w:tab w:val="right" w:pos="9360"/>
+      </w:tabs>
+      <w:spacing w:after="0" w:line="240" w:lineRule="auto"/>
+    </w:pPr>
+  </w:style>
+  <w:style w:type="character" w:customStyle="1" w:styleId="HeaderChar">
+    <w:name w:val="Header Char"/>
+    <w:basedOn w:val="DefaultParagraphFont"/>
+    <w:link w:val="Header"/>
+    <w:uiPriority w:val="99"/>
+    <w:rsid w:val="00094F29"/>
+  </w:style>
+  <w:style w:type="paragraph" w:styleId="Footer">
+    <w:name w:val="footer"/>
+    <w:basedOn w:val="Normal"/>
+    <w:link w:val="FooterChar"/>
+    <w:uiPriority w:val="99"/>
+    <w:unhideWhenUsed/>
+    <w:rsid w:val="00094F29"/>
+    <w:pPr>
+      <w:tabs>
+        <w:tab w:val="center" w:pos="4680"/>
+        <w:tab w:val="right" w:pos="9360"/>
+      </w:tabs>
+      <w:spacing w:after="0" w:line="240" w:lineRule="auto"/>
+    </w:pPr>
+  </w:style>
+  <w:style w:type="character" w:customStyle="1" w:styleId="FooterChar">
+    <w:name w:val="Footer Char"/>
+    <w:basedOn w:val="DefaultParagraphFont"/>
+    <w:link w:val="Footer"/>
+    <w:uiPriority w:val="99"/>
+    <w:rsid w:val="00094F29"/>
+  </w:style>
 </w:styles>
 </file>
 

</xml_diff>